<commit_message>
Game Design  Final Project Code
</commit_message>
<xml_diff>
--- a/StudentFolders/A1/Wentao Z/Proposal (AutoRecovered).docx
+++ b/StudentFolders/A1/Wentao Z/Proposal (AutoRecovered).docx
@@ -47,9 +47,6 @@
     </w:p>
     <w:p>
       <w:r>
-        <w:rPr>
-          <w:noProof/>
-        </w:rPr>
         <w:drawing>
           <wp:inline distT="0" distB="0" distL="0" distR="0" wp14:anchorId="42171AC4" wp14:editId="14C16004">
             <wp:extent cx="4292600" cy="2279650"/>
@@ -68,7 +65,7 @@
                     </pic:cNvPicPr>
                   </pic:nvPicPr>
                   <pic:blipFill>
-                    <a:blip r:embed="rId8">
+                    <a:blip r:embed="rId5">
                       <a:extLst>
                         <a:ext uri="{28A0092B-C50C-407E-A947-70E740481C1C}">
                           <a14:useLocalDpi xmlns:a14="http://schemas.microsoft.com/office/drawing/2010/main" val="0"/>
@@ -1065,9 +1062,6 @@
     </w:p>
     <w:p>
       <w:r>
-        <w:rPr>
-          <w:noProof/>
-        </w:rPr>
         <w:drawing>
           <wp:inline distT="0" distB="0" distL="0" distR="0" wp14:anchorId="0B6AAF64" wp14:editId="2C088606">
             <wp:extent cx="2432050" cy="1892300"/>
@@ -1086,7 +1080,7 @@
                     </pic:cNvPicPr>
                   </pic:nvPicPr>
                   <pic:blipFill>
-                    <a:blip r:embed="rId9">
+                    <a:blip r:embed="rId6">
                       <a:extLst>
                         <a:ext uri="{28A0092B-C50C-407E-A947-70E740481C1C}">
                           <a14:useLocalDpi xmlns:a14="http://schemas.microsoft.com/office/drawing/2010/main" val="0"/>
@@ -1268,9 +1262,6 @@
     </w:p>
     <w:p>
       <w:r>
-        <w:rPr>
-          <w:noProof/>
-        </w:rPr>
         <w:drawing>
           <wp:inline distT="0" distB="0" distL="0" distR="0" wp14:anchorId="16D74F2B" wp14:editId="5593ABB2">
             <wp:extent cx="5937250" cy="3695700"/>
@@ -1289,7 +1280,7 @@
                     </pic:cNvPicPr>
                   </pic:nvPicPr>
                   <pic:blipFill>
-                    <a:blip r:embed="rId10">
+                    <a:blip r:embed="rId7">
                       <a:extLst>
                         <a:ext uri="{28A0092B-C50C-407E-A947-70E740481C1C}">
                           <a14:useLocalDpi xmlns:a14="http://schemas.microsoft.com/office/drawing/2010/main" val="0"/>
@@ -1369,9 +1360,6 @@
     <w:p/>
     <w:p>
       <w:r>
-        <w:rPr>
-          <w:noProof/>
-        </w:rPr>
         <w:drawing>
           <wp:inline distT="0" distB="0" distL="0" distR="0" wp14:anchorId="5D04F52B" wp14:editId="1D2EB6F7">
             <wp:extent cx="5937250" cy="4292600"/>
@@ -1390,7 +1378,7 @@
                     </pic:cNvPicPr>
                   </pic:nvPicPr>
                   <pic:blipFill>
-                    <a:blip r:embed="rId11">
+                    <a:blip r:embed="rId8">
                       <a:extLst>
                         <a:ext uri="{28A0092B-C50C-407E-A947-70E740481C1C}">
                           <a14:useLocalDpi xmlns:a14="http://schemas.microsoft.com/office/drawing/2010/main" val="0"/>
@@ -1427,9 +1415,6 @@
         <w:br/>
       </w:r>
       <w:r>
-        <w:rPr>
-          <w:noProof/>
-        </w:rPr>
         <w:drawing>
           <wp:inline distT="0" distB="0" distL="0" distR="0" wp14:anchorId="223E5694" wp14:editId="0DFA1CB0">
             <wp:extent cx="2724150" cy="2609850"/>
@@ -1448,7 +1433,7 @@
                     </pic:cNvPicPr>
                   </pic:nvPicPr>
                   <pic:blipFill>
-                    <a:blip r:embed="rId12" cstate="print">
+                    <a:blip r:embed="rId9" cstate="print">
                       <a:extLst>
                         <a:ext uri="{28A0092B-C50C-407E-A947-70E740481C1C}">
                           <a14:useLocalDpi xmlns:a14="http://schemas.microsoft.com/office/drawing/2010/main" val="0"/>
@@ -1522,9 +1507,6 @@
         <w:br/>
       </w:r>
       <w:r>
-        <w:rPr>
-          <w:noProof/>
-        </w:rPr>
         <w:drawing>
           <wp:inline distT="0" distB="0" distL="0" distR="0" wp14:anchorId="4C8C2B14" wp14:editId="5BCCC4A3">
             <wp:extent cx="2546350" cy="2667000"/>
@@ -1543,7 +1525,7 @@
                     </pic:cNvPicPr>
                   </pic:nvPicPr>
                   <pic:blipFill>
-                    <a:blip r:embed="rId13">
+                    <a:blip r:embed="rId10">
                       <a:extLst>
                         <a:ext uri="{28A0092B-C50C-407E-A947-70E740481C1C}">
                           <a14:useLocalDpi xmlns:a14="http://schemas.microsoft.com/office/drawing/2010/main" val="0"/>
@@ -1707,17 +1689,19 @@
       </w:r>
       <w:proofErr w:type="spellEnd"/>
       <w:r>
-        <w:t xml:space="preserve"> dir</w:t>
-      </w:r>
-    </w:p>
-    <w:p>
-      <w:r>
-        <w:br/>
-      </w:r>
-      <w:r>
-        <w:rPr>
-          <w:noProof/>
-        </w:rPr>
+        <w:t xml:space="preserve"> </w:t>
+      </w:r>
+      <w:proofErr w:type="spellStart"/>
+      <w:r>
+        <w:t>dir</w:t>
+      </w:r>
+      <w:proofErr w:type="spellEnd"/>
+    </w:p>
+    <w:p>
+      <w:r>
+        <w:br/>
+      </w:r>
+      <w:r>
         <w:drawing>
           <wp:inline distT="0" distB="0" distL="0" distR="0" wp14:anchorId="385D8AC3" wp14:editId="242DD967">
             <wp:extent cx="5943600" cy="3702050"/>
@@ -1736,7 +1720,7 @@
                     </pic:cNvPicPr>
                   </pic:nvPicPr>
                   <pic:blipFill>
-                    <a:blip r:embed="rId14" cstate="print">
+                    <a:blip r:embed="rId11" cstate="print">
                       <a:extLst>
                         <a:ext uri="{28A0092B-C50C-407E-A947-70E740481C1C}">
                           <a14:useLocalDpi xmlns:a14="http://schemas.microsoft.com/office/drawing/2010/main" val="0"/>
@@ -1810,9 +1794,6 @@
         <w:br/>
       </w:r>
       <w:r>
-        <w:rPr>
-          <w:noProof/>
-        </w:rPr>
         <w:drawing>
           <wp:inline distT="0" distB="0" distL="0" distR="0" wp14:anchorId="77A13546" wp14:editId="7D5E3117">
             <wp:extent cx="5937250" cy="3733800"/>
@@ -1831,7 +1812,7 @@
                     </pic:cNvPicPr>
                   </pic:nvPicPr>
                   <pic:blipFill>
-                    <a:blip r:embed="rId15">
+                    <a:blip r:embed="rId12">
                       <a:extLst>
                         <a:ext uri="{28A0092B-C50C-407E-A947-70E740481C1C}">
                           <a14:useLocalDpi xmlns:a14="http://schemas.microsoft.com/office/drawing/2010/main" val="0"/>
@@ -1866,9 +1847,6 @@
         <w:br/>
       </w:r>
       <w:r>
-        <w:rPr>
-          <w:noProof/>
-        </w:rPr>
         <w:drawing>
           <wp:inline distT="0" distB="0" distL="0" distR="0" wp14:anchorId="7E85C7D8" wp14:editId="218E378B">
             <wp:extent cx="5943600" cy="3727450"/>
@@ -1887,7 +1865,7 @@
                     </pic:cNvPicPr>
                   </pic:nvPicPr>
                   <pic:blipFill>
-                    <a:blip r:embed="rId16">
+                    <a:blip r:embed="rId13">
                       <a:extLst>
                         <a:ext uri="{28A0092B-C50C-407E-A947-70E740481C1C}">
                           <a14:useLocalDpi xmlns:a14="http://schemas.microsoft.com/office/drawing/2010/main" val="0"/>
@@ -2106,9 +2084,6 @@
     </w:p>
     <w:p>
       <w:r>
-        <w:rPr>
-          <w:noProof/>
-        </w:rPr>
         <w:drawing>
           <wp:inline distT="0" distB="0" distL="0" distR="0" wp14:anchorId="6D50AEC4" wp14:editId="67F59075">
             <wp:extent cx="5943600" cy="4756150"/>
@@ -2127,7 +2102,7 @@
                     </pic:cNvPicPr>
                   </pic:nvPicPr>
                   <pic:blipFill>
-                    <a:blip r:embed="rId17">
+                    <a:blip r:embed="rId14">
                       <a:extLst>
                         <a:ext uri="{28A0092B-C50C-407E-A947-70E740481C1C}">
                           <a14:useLocalDpi xmlns:a14="http://schemas.microsoft.com/office/drawing/2010/main" val="0"/>
@@ -2161,9 +2136,6 @@
     </w:p>
     <w:p>
       <w:r>
-        <w:rPr>
-          <w:noProof/>
-        </w:rPr>
         <w:drawing>
           <wp:inline distT="0" distB="0" distL="0" distR="0" wp14:anchorId="4B4D7470" wp14:editId="52B3C4D9">
             <wp:extent cx="5943600" cy="3587750"/>
@@ -2182,7 +2154,7 @@
                     </pic:cNvPicPr>
                   </pic:nvPicPr>
                   <pic:blipFill>
-                    <a:blip r:embed="rId18">
+                    <a:blip r:embed="rId15">
                       <a:extLst>
                         <a:ext uri="{28A0092B-C50C-407E-A947-70E740481C1C}">
                           <a14:useLocalDpi xmlns:a14="http://schemas.microsoft.com/office/drawing/2010/main" val="0"/>
@@ -2214,56 +2186,77 @@
         </w:drawing>
       </w:r>
     </w:p>
+    <w:p>
+      <w:r>
+        <w:t>Goals for 11/18</w:t>
+      </w:r>
+    </w:p>
     <w:p/>
     <w:p>
       <w:r>
-        <w:t>Goals for 11/</w:t>
-      </w:r>
-      <w:r>
-        <w:t>20</w:t>
+        <w:t>Check the intersection between a polygon and circles</w:t>
       </w:r>
     </w:p>
     <w:p/>
     <w:p>
       <w:r>
-        <w:t>Improve on the homing bullet class</w:t>
-      </w:r>
-    </w:p>
-    <w:p>
-      <w:r>
         <w:t>Accomplishments:</w:t>
       </w:r>
     </w:p>
     <w:p>
       <w:r>
-        <w:t>Fixed homing bullet class so it only tracks one enemy at a time.</w:t>
-      </w:r>
-    </w:p>
-    <w:p>
-      <w:r>
-        <w:t>Problems: null pointer exception, add collisions for all classes.</w:t>
+        <w:t>I added more functionality</w:t>
+      </w:r>
+      <w:r>
+        <w:t xml:space="preserve"> and fixed some </w:t>
+      </w:r>
+      <w:proofErr w:type="gramStart"/>
+      <w:r>
+        <w:t>issues.</w:t>
+      </w:r>
+      <w:r>
+        <w:t>(</w:t>
+      </w:r>
+      <w:proofErr w:type="gramEnd"/>
+      <w:r>
+        <w:t>Screenshots below)</w:t>
+      </w:r>
+      <w:r>
+        <w:t xml:space="preserve">. </w:t>
       </w:r>
     </w:p>
     <w:p/>
     <w:p>
       <w:r>
-        <w:t>Goals for next class Intersection between polygon and circle</w:t>
-      </w:r>
-      <w:r>
-        <w:t>, add a second mode of fire for the player</w:t>
+        <w:t>Problems: add collisions for all classes.</w:t>
       </w:r>
     </w:p>
     <w:p/>
     <w:p>
       <w:r>
-        <w:rPr>
-          <w:noProof/>
-        </w:rPr>
+        <w:t xml:space="preserve">Goals for next class Intersection between polygon and circle+ </w:t>
+      </w:r>
+      <w:proofErr w:type="spellStart"/>
+      <w:r>
+        <w:t>Pvector</w:t>
+      </w:r>
+      <w:proofErr w:type="spellEnd"/>
+      <w:r>
+        <w:t xml:space="preserve"> </w:t>
+      </w:r>
+      <w:proofErr w:type="spellStart"/>
+      <w:r>
+        <w:t>dir</w:t>
+      </w:r>
+      <w:proofErr w:type="spellEnd"/>
+    </w:p>
+    <w:p>
+      <w:r>
         <w:drawing>
-          <wp:inline distT="0" distB="0" distL="0" distR="0" wp14:anchorId="2D3AF7CE" wp14:editId="7201F5A7">
-            <wp:extent cx="5943600" cy="2693670"/>
+          <wp:inline distT="0" distB="0" distL="0" distR="0" wp14:anchorId="18DD02B0" wp14:editId="3516291B">
+            <wp:extent cx="5943600" cy="3849370"/>
             <wp:effectExtent l="0" t="0" r="0" b="0"/>
-            <wp:docPr id="1077307218" name="Picture 1" descr="A screenshot of a computer&#10;&#10;AI-generated content may be incorrect."/>
+            <wp:docPr id="302395144" name="Picture 1" descr="A screenshot of a computer program&#10;&#10;AI-generated content may be incorrect."/>
             <wp:cNvGraphicFramePr>
               <a:graphicFrameLocks xmlns:a="http://schemas.openxmlformats.org/drawingml/2006/main" noChangeAspect="1"/>
             </wp:cNvGraphicFramePr>
@@ -2271,11 +2264,11 @@
               <a:graphicData uri="http://schemas.openxmlformats.org/drawingml/2006/picture">
                 <pic:pic xmlns:pic="http://schemas.openxmlformats.org/drawingml/2006/picture">
                   <pic:nvPicPr>
-                    <pic:cNvPr id="1077307218" name="Picture 1" descr="A screenshot of a computer&#10;&#10;AI-generated content may be incorrect."/>
+                    <pic:cNvPr id="302395144" name="Picture 1" descr="A screenshot of a computer program&#10;&#10;AI-generated content may be incorrect."/>
                     <pic:cNvPicPr/>
                   </pic:nvPicPr>
                   <pic:blipFill>
-                    <a:blip r:embed="rId19"/>
+                    <a:blip r:embed="rId16"/>
                     <a:stretch>
                       <a:fillRect/>
                     </a:stretch>
@@ -2283,7 +2276,7 @@
                   <pic:spPr>
                     <a:xfrm>
                       <a:off x="0" y="0"/>
-                      <a:ext cx="5943600" cy="2693670"/>
+                      <a:ext cx="5943600" cy="3849370"/>
                     </a:xfrm>
                     <a:prstGeom prst="rect">
                       <a:avLst/>
@@ -2296,48 +2289,13 @@
         </w:drawing>
       </w:r>
     </w:p>
-    <w:p/>
-    <w:p>
-      <w:r>
-        <w:t>Goals for 11/24</w:t>
-      </w:r>
-    </w:p>
-    <w:p>
-      <w:r>
-        <w:t>Intersection between polygon and circle</w:t>
-      </w:r>
-      <w:r>
-        <w:t xml:space="preserve">, add a second mode of fire for the player and add collisions for all classes. </w:t>
-      </w:r>
-    </w:p>
-    <w:p/>
-    <w:p>
-      <w:r>
-        <w:t>Accomplishments:</w:t>
-      </w:r>
-    </w:p>
-    <w:p>
-      <w:r>
-        <w:t>Added a second mode, added collisions for other classes. (SS below).</w:t>
-      </w:r>
-    </w:p>
-    <w:p/>
-    <w:p>
-      <w:r>
-        <w:t>Goals: Check intersection between polygon and circle</w:t>
-      </w:r>
-    </w:p>
-    <w:p/>
-    <w:p>
-      <w:r>
-        <w:rPr>
-          <w:noProof/>
-        </w:rPr>
+    <w:p>
+      <w:r>
         <w:drawing>
-          <wp:inline distT="0" distB="0" distL="0" distR="0" wp14:anchorId="6B4CCC96" wp14:editId="4546401D">
-            <wp:extent cx="5943600" cy="2478405"/>
+          <wp:inline distT="0" distB="0" distL="0" distR="0" wp14:anchorId="1C79C4F9" wp14:editId="66B216C5">
+            <wp:extent cx="5734345" cy="2216264"/>
             <wp:effectExtent l="0" t="0" r="0" b="0"/>
-            <wp:docPr id="2012253331" name="Picture 1" descr="A screenshot of a computer program&#10;&#10;AI-generated content may be incorrect."/>
+            <wp:docPr id="2063683146" name="Picture 1" descr="A screenshot of a computer code&#10;&#10;AI-generated content may be incorrect."/>
             <wp:cNvGraphicFramePr>
               <a:graphicFrameLocks xmlns:a="http://schemas.openxmlformats.org/drawingml/2006/main" noChangeAspect="1"/>
             </wp:cNvGraphicFramePr>
@@ -2345,11 +2303,11 @@
               <a:graphicData uri="http://schemas.openxmlformats.org/drawingml/2006/picture">
                 <pic:pic xmlns:pic="http://schemas.openxmlformats.org/drawingml/2006/picture">
                   <pic:nvPicPr>
-                    <pic:cNvPr id="2012253331" name="Picture 1" descr="A screenshot of a computer program&#10;&#10;AI-generated content may be incorrect."/>
+                    <pic:cNvPr id="2063683146" name="Picture 1" descr="A screenshot of a computer code&#10;&#10;AI-generated content may be incorrect."/>
                     <pic:cNvPicPr/>
                   </pic:nvPicPr>
                   <pic:blipFill>
-                    <a:blip r:embed="rId20"/>
+                    <a:blip r:embed="rId17"/>
                     <a:stretch>
                       <a:fillRect/>
                     </a:stretch>
@@ -2357,7 +2315,7 @@
                   <pic:spPr>
                     <a:xfrm>
                       <a:off x="0" y="0"/>
-                      <a:ext cx="5943600" cy="2478405"/>
+                      <a:ext cx="5734345" cy="2216264"/>
                     </a:xfrm>
                     <a:prstGeom prst="rect">
                       <a:avLst/>
@@ -2369,381 +2327,6 @@
           </wp:inline>
         </w:drawing>
       </w:r>
-    </w:p>
-    <w:p>
-      <w:r>
-        <w:rPr>
-          <w:noProof/>
-        </w:rPr>
-        <w:drawing>
-          <wp:inline distT="0" distB="0" distL="0" distR="0" wp14:anchorId="16EE7386" wp14:editId="2670F90A">
-            <wp:extent cx="5943600" cy="3629660"/>
-            <wp:effectExtent l="0" t="0" r="0" b="8890"/>
-            <wp:docPr id="1545704542" name="Picture 1" descr="A computer code with many text&#10;&#10;AI-generated content may be incorrect."/>
-            <wp:cNvGraphicFramePr>
-              <a:graphicFrameLocks xmlns:a="http://schemas.openxmlformats.org/drawingml/2006/main" noChangeAspect="1"/>
-            </wp:cNvGraphicFramePr>
-            <a:graphic xmlns:a="http://schemas.openxmlformats.org/drawingml/2006/main">
-              <a:graphicData uri="http://schemas.openxmlformats.org/drawingml/2006/picture">
-                <pic:pic xmlns:pic="http://schemas.openxmlformats.org/drawingml/2006/picture">
-                  <pic:nvPicPr>
-                    <pic:cNvPr id="1545704542" name="Picture 1" descr="A computer code with many text&#10;&#10;AI-generated content may be incorrect."/>
-                    <pic:cNvPicPr/>
-                  </pic:nvPicPr>
-                  <pic:blipFill>
-                    <a:blip r:embed="rId21"/>
-                    <a:stretch>
-                      <a:fillRect/>
-                    </a:stretch>
-                  </pic:blipFill>
-                  <pic:spPr>
-                    <a:xfrm>
-                      <a:off x="0" y="0"/>
-                      <a:ext cx="5943600" cy="3629660"/>
-                    </a:xfrm>
-                    <a:prstGeom prst="rect">
-                      <a:avLst/>
-                    </a:prstGeom>
-                  </pic:spPr>
-                </pic:pic>
-              </a:graphicData>
-            </a:graphic>
-          </wp:inline>
-        </w:drawing>
-      </w:r>
-    </w:p>
-    <w:p/>
-    <w:p>
-      <w:r>
-        <w:t>Goals for 11/26</w:t>
-      </w:r>
-    </w:p>
-    <w:p>
-      <w:r>
-        <w:t>Make the bullets look more like bullets</w:t>
-      </w:r>
-    </w:p>
-    <w:p>
-      <w:r>
-        <w:t>Accomplishments:</w:t>
-      </w:r>
-    </w:p>
-    <w:p>
-      <w:r>
-        <w:t>Added visuals</w:t>
-      </w:r>
-    </w:p>
-    <w:p>
-      <w:r>
-        <w:t>Goals: Check intersection between polygon and circle</w:t>
-      </w:r>
-    </w:p>
-    <w:p>
-      <w:pPr>
-        <w:ind w:firstLine="720"/>
-      </w:pPr>
-      <w:r>
-        <w:rPr>
-          <w:noProof/>
-        </w:rPr>
-        <w:drawing>
-          <wp:inline distT="0" distB="0" distL="0" distR="0" wp14:anchorId="369F7F48" wp14:editId="1D035C09">
-            <wp:extent cx="5943600" cy="4399915"/>
-            <wp:effectExtent l="0" t="0" r="0" b="635"/>
-            <wp:docPr id="1297947847" name="Picture 1" descr="A screenshot of a video game&#10;&#10;AI-generated content may be incorrect."/>
-            <wp:cNvGraphicFramePr>
-              <a:graphicFrameLocks xmlns:a="http://schemas.openxmlformats.org/drawingml/2006/main" noChangeAspect="1"/>
-            </wp:cNvGraphicFramePr>
-            <a:graphic xmlns:a="http://schemas.openxmlformats.org/drawingml/2006/main">
-              <a:graphicData uri="http://schemas.openxmlformats.org/drawingml/2006/picture">
-                <pic:pic xmlns:pic="http://schemas.openxmlformats.org/drawingml/2006/picture">
-                  <pic:nvPicPr>
-                    <pic:cNvPr id="1297947847" name="Picture 1" descr="A screenshot of a video game&#10;&#10;AI-generated content may be incorrect."/>
-                    <pic:cNvPicPr/>
-                  </pic:nvPicPr>
-                  <pic:blipFill>
-                    <a:blip r:embed="rId22"/>
-                    <a:stretch>
-                      <a:fillRect/>
-                    </a:stretch>
-                  </pic:blipFill>
-                  <pic:spPr>
-                    <a:xfrm>
-                      <a:off x="0" y="0"/>
-                      <a:ext cx="5943600" cy="4399915"/>
-                    </a:xfrm>
-                    <a:prstGeom prst="rect">
-                      <a:avLst/>
-                    </a:prstGeom>
-                  </pic:spPr>
-                </pic:pic>
-              </a:graphicData>
-            </a:graphic>
-          </wp:inline>
-        </w:drawing>
-      </w:r>
-    </w:p>
-    <w:p/>
-    <w:p>
-      <w:r>
-        <w:t xml:space="preserve">Goals for 12/2 </w:t>
-      </w:r>
-    </w:p>
-    <w:p>
-      <w:r>
-        <w:t xml:space="preserve">Add a tutorial game to make it more playable. </w:t>
-      </w:r>
-    </w:p>
-    <w:p/>
-    <w:p>
-      <w:r>
-        <w:t xml:space="preserve">Accomplishments: </w:t>
-      </w:r>
-    </w:p>
-    <w:p>
-      <w:r>
-        <w:t xml:space="preserve">I added a </w:t>
-      </w:r>
-      <w:proofErr w:type="gramStart"/>
-      <w:r>
-        <w:t>step by step</w:t>
-      </w:r>
-      <w:proofErr w:type="gramEnd"/>
-      <w:r>
-        <w:t xml:space="preserve"> tutorial that explains </w:t>
-      </w:r>
-      <w:r>
-        <w:t xml:space="preserve">how to play the game as there are many features that make it confusing. </w:t>
-      </w:r>
-    </w:p>
-    <w:p/>
-    <w:p>
-      <w:r>
-        <w:t>Goals for next class:</w:t>
-      </w:r>
-    </w:p>
-    <w:p>
-      <w:r>
-        <w:t xml:space="preserve">I will continue to add to the code to make the game easier to play </w:t>
-      </w:r>
-      <w:proofErr w:type="gramStart"/>
-      <w:r>
-        <w:t>and  less</w:t>
-      </w:r>
-      <w:proofErr w:type="gramEnd"/>
-      <w:r>
-        <w:t xml:space="preserve"> confusing. </w:t>
-      </w:r>
-      <w:r>
-        <w:t xml:space="preserve">I also want to separate the different functionalities of the game into different classes to make debugging and finding parts of my code easier. </w:t>
-      </w:r>
-    </w:p>
-    <w:p>
-      <w:r>
-        <w:rPr>
-          <w:noProof/>
-        </w:rPr>
-        <w:drawing>
-          <wp:inline distT="0" distB="0" distL="0" distR="0" wp14:anchorId="06A6D52E" wp14:editId="26FDEF43">
-            <wp:extent cx="10278909" cy="6773220"/>
-            <wp:effectExtent l="0" t="0" r="8255" b="8890"/>
-            <wp:docPr id="1558178258" name="Picture 1" descr="A screenshot of a computer program&#10;&#10;AI-generated content may be incorrect."/>
-            <wp:cNvGraphicFramePr>
-              <a:graphicFrameLocks xmlns:a="http://schemas.openxmlformats.org/drawingml/2006/main" noChangeAspect="1"/>
-            </wp:cNvGraphicFramePr>
-            <a:graphic xmlns:a="http://schemas.openxmlformats.org/drawingml/2006/main">
-              <a:graphicData uri="http://schemas.openxmlformats.org/drawingml/2006/picture">
-                <pic:pic xmlns:pic="http://schemas.openxmlformats.org/drawingml/2006/picture">
-                  <pic:nvPicPr>
-                    <pic:cNvPr id="1558178258" name="Picture 1" descr="A screenshot of a computer program&#10;&#10;AI-generated content may be incorrect."/>
-                    <pic:cNvPicPr/>
-                  </pic:nvPicPr>
-                  <pic:blipFill>
-                    <a:blip r:embed="rId23"/>
-                    <a:stretch>
-                      <a:fillRect/>
-                    </a:stretch>
-                  </pic:blipFill>
-                  <pic:spPr>
-                    <a:xfrm>
-                      <a:off x="0" y="0"/>
-                      <a:ext cx="10278909" cy="6773220"/>
-                    </a:xfrm>
-                    <a:prstGeom prst="rect">
-                      <a:avLst/>
-                    </a:prstGeom>
-                  </pic:spPr>
-                </pic:pic>
-              </a:graphicData>
-            </a:graphic>
-          </wp:inline>
-        </w:drawing>
-      </w:r>
-    </w:p>
-    <w:p>
-      <w:r>
-        <w:rPr>
-          <w:noProof/>
-        </w:rPr>
-        <w:drawing>
-          <wp:inline distT="0" distB="0" distL="0" distR="0" wp14:anchorId="09C01B3B" wp14:editId="47F21268">
-            <wp:extent cx="6445581" cy="4464279"/>
-            <wp:effectExtent l="0" t="0" r="0" b="0"/>
-            <wp:docPr id="1744548080" name="Picture 1" descr="A screenshot of a computer program&#10;&#10;AI-generated content may be incorrect."/>
-            <wp:cNvGraphicFramePr>
-              <a:graphicFrameLocks xmlns:a="http://schemas.openxmlformats.org/drawingml/2006/main" noChangeAspect="1"/>
-            </wp:cNvGraphicFramePr>
-            <a:graphic xmlns:a="http://schemas.openxmlformats.org/drawingml/2006/main">
-              <a:graphicData uri="http://schemas.openxmlformats.org/drawingml/2006/picture">
-                <pic:pic xmlns:pic="http://schemas.openxmlformats.org/drawingml/2006/picture">
-                  <pic:nvPicPr>
-                    <pic:cNvPr id="1744548080" name="Picture 1" descr="A screenshot of a computer program&#10;&#10;AI-generated content may be incorrect."/>
-                    <pic:cNvPicPr/>
-                  </pic:nvPicPr>
-                  <pic:blipFill>
-                    <a:blip r:embed="rId24"/>
-                    <a:stretch>
-                      <a:fillRect/>
-                    </a:stretch>
-                  </pic:blipFill>
-                  <pic:spPr>
-                    <a:xfrm>
-                      <a:off x="0" y="0"/>
-                      <a:ext cx="6445581" cy="4464279"/>
-                    </a:xfrm>
-                    <a:prstGeom prst="rect">
-                      <a:avLst/>
-                    </a:prstGeom>
-                  </pic:spPr>
-                </pic:pic>
-              </a:graphicData>
-            </a:graphic>
-          </wp:inline>
-        </w:drawing>
-      </w:r>
-    </w:p>
-    <w:p>
-      <w:r>
-        <w:rPr>
-          <w:noProof/>
-        </w:rPr>
-        <w:drawing>
-          <wp:inline distT="0" distB="0" distL="0" distR="0" wp14:anchorId="116B4B94" wp14:editId="7BF2E5A2">
-            <wp:extent cx="5734345" cy="3505380"/>
-            <wp:effectExtent l="0" t="0" r="0" b="0"/>
-            <wp:docPr id="1246665830" name="Picture 1" descr="A white screen with green text&#10;&#10;AI-generated content may be incorrect."/>
-            <wp:cNvGraphicFramePr>
-              <a:graphicFrameLocks xmlns:a="http://schemas.openxmlformats.org/drawingml/2006/main" noChangeAspect="1"/>
-            </wp:cNvGraphicFramePr>
-            <a:graphic xmlns:a="http://schemas.openxmlformats.org/drawingml/2006/main">
-              <a:graphicData uri="http://schemas.openxmlformats.org/drawingml/2006/picture">
-                <pic:pic xmlns:pic="http://schemas.openxmlformats.org/drawingml/2006/picture">
-                  <pic:nvPicPr>
-                    <pic:cNvPr id="1246665830" name="Picture 1" descr="A white screen with green text&#10;&#10;AI-generated content may be incorrect."/>
-                    <pic:cNvPicPr/>
-                  </pic:nvPicPr>
-                  <pic:blipFill>
-                    <a:blip r:embed="rId25"/>
-                    <a:stretch>
-                      <a:fillRect/>
-                    </a:stretch>
-                  </pic:blipFill>
-                  <pic:spPr>
-                    <a:xfrm>
-                      <a:off x="0" y="0"/>
-                      <a:ext cx="5734345" cy="3505380"/>
-                    </a:xfrm>
-                    <a:prstGeom prst="rect">
-                      <a:avLst/>
-                    </a:prstGeom>
-                  </pic:spPr>
-                </pic:pic>
-              </a:graphicData>
-            </a:graphic>
-          </wp:inline>
-        </w:drawing>
-      </w:r>
-    </w:p>
-    <w:p>
-      <w:pPr>
-        <w:tabs>
-          <w:tab w:val="left" w:pos="111"/>
-        </w:tabs>
-      </w:pPr>
-      <w:r>
-        <w:tab/>
-        <w:t>Goals for 12/4/2025</w:t>
-      </w:r>
-    </w:p>
-    <w:p>
-      <w:pPr>
-        <w:tabs>
-          <w:tab w:val="left" w:pos="111"/>
-        </w:tabs>
-      </w:pPr>
-      <w:r>
-        <w:t>Co</w:t>
-      </w:r>
-      <w:r>
-        <w:t xml:space="preserve">ntinue the tutorial for the game, make the text and game look more appealing </w:t>
-      </w:r>
-    </w:p>
-    <w:p>
-      <w:pPr>
-        <w:tabs>
-          <w:tab w:val="left" w:pos="111"/>
-        </w:tabs>
-      </w:pPr>
-    </w:p>
-    <w:p>
-      <w:pPr>
-        <w:tabs>
-          <w:tab w:val="left" w:pos="111"/>
-        </w:tabs>
-      </w:pPr>
-      <w:r>
-        <w:t>Accomplishments</w:t>
-      </w:r>
-    </w:p>
-    <w:p>
-      <w:pPr>
-        <w:tabs>
-          <w:tab w:val="left" w:pos="111"/>
-        </w:tabs>
-      </w:pPr>
-      <w:r>
-        <w:t xml:space="preserve">Made it to the second last step of the tutorial </w:t>
-      </w:r>
-      <w:r>
-        <w:t xml:space="preserve">for the game. </w:t>
-      </w:r>
-    </w:p>
-    <w:p>
-      <w:pPr>
-        <w:tabs>
-          <w:tab w:val="left" w:pos="111"/>
-        </w:tabs>
-      </w:pPr>
-      <w:r>
-        <w:t>Notes for next class</w:t>
-      </w:r>
-    </w:p>
-    <w:p>
-      <w:pPr>
-        <w:tabs>
-          <w:tab w:val="left" w:pos="111"/>
-        </w:tabs>
-      </w:pPr>
-      <w:r>
-        <w:t xml:space="preserve">Split all function into separate classes to clean up the code and finish the tutorial. </w:t>
-      </w:r>
-    </w:p>
-    <w:p>
-      <w:pPr>
-        <w:tabs>
-          <w:tab w:val="left" w:pos="111"/>
-        </w:tabs>
-      </w:pPr>
     </w:p>
     <w:sectPr>
       <w:pgSz w:w="12240" w:h="15840"/>
@@ -3971,7 +3554,6 @@
   <w:style w:type="character" w:default="1" w:styleId="DefaultParagraphFont">
     <w:name w:val="Default Paragraph Font"/>
     <w:uiPriority w:val="1"/>
-    <w:semiHidden/>
     <w:unhideWhenUsed/>
   </w:style>
   <w:style w:type="table" w:default="1" w:styleId="TableNormal">
@@ -4601,263 +4183,4 @@
     </a:ext>
   </a:extLst>
 </a:theme>
-</file>
-
-<file path=customXml/item1.xml><?xml version="1.0" encoding="utf-8"?>
-<ct:contentTypeSchema xmlns:ct="http://schemas.microsoft.com/office/2006/metadata/contentType" xmlns:ma="http://schemas.microsoft.com/office/2006/metadata/properties/metaAttributes" ct:_="" ma:_="" ma:contentTypeName="Document" ma:contentTypeID="0x0101007CE1B03EBC6DF74FAE1722719C867476" ma:contentTypeVersion="13" ma:contentTypeDescription="Create a new document." ma:contentTypeScope="" ma:versionID="2141386873cebcb8f9bc6d3a7c14f156">
-  <xsd:schema xmlns:xsd="http://www.w3.org/2001/XMLSchema" xmlns:xs="http://www.w3.org/2001/XMLSchema" xmlns:p="http://schemas.microsoft.com/office/2006/metadata/properties" xmlns:ns3="08df0c4f-afa2-4d5e-90e7-353b5d0fb03c" targetNamespace="http://schemas.microsoft.com/office/2006/metadata/properties" ma:root="true" ma:fieldsID="7a258f039364e50977a2918cbdd3c503" ns3:_="">
-    <xsd:import namespace="08df0c4f-afa2-4d5e-90e7-353b5d0fb03c"/>
-    <xsd:element name="properties">
-      <xsd:complexType>
-        <xsd:sequence>
-          <xsd:element name="documentManagement">
-            <xsd:complexType>
-              <xsd:all>
-                <xsd:element ref="ns3:MediaServiceMetadata" minOccurs="0"/>
-                <xsd:element ref="ns3:MediaServiceFastMetadata" minOccurs="0"/>
-                <xsd:element ref="ns3:MediaServiceDateTaken" minOccurs="0"/>
-                <xsd:element ref="ns3:MediaServiceAutoTags" minOccurs="0"/>
-                <xsd:element ref="ns3:MediaServiceGenerationTime" minOccurs="0"/>
-                <xsd:element ref="ns3:MediaServiceEventHashCode" minOccurs="0"/>
-                <xsd:element ref="ns3:MediaServiceOCR" minOccurs="0"/>
-                <xsd:element ref="ns3:MediaServiceLocation" minOccurs="0"/>
-                <xsd:element ref="ns3:MediaLengthInSeconds" minOccurs="0"/>
-                <xsd:element ref="ns3:MediaServiceObjectDetectorVersions" minOccurs="0"/>
-                <xsd:element ref="ns3:MediaServiceSystemTags" minOccurs="0"/>
-                <xsd:element ref="ns3:MediaServiceSearchProperties" minOccurs="0"/>
-                <xsd:element ref="ns3:_activity" minOccurs="0"/>
-              </xsd:all>
-            </xsd:complexType>
-          </xsd:element>
-        </xsd:sequence>
-      </xsd:complexType>
-    </xsd:element>
-  </xsd:schema>
-  <xsd:schema xmlns:xsd="http://www.w3.org/2001/XMLSchema" xmlns:xs="http://www.w3.org/2001/XMLSchema" xmlns:dms="http://schemas.microsoft.com/office/2006/documentManagement/types" xmlns:pc="http://schemas.microsoft.com/office/infopath/2007/PartnerControls" targetNamespace="08df0c4f-afa2-4d5e-90e7-353b5d0fb03c" elementFormDefault="qualified">
-    <xsd:import namespace="http://schemas.microsoft.com/office/2006/documentManagement/types"/>
-    <xsd:import namespace="http://schemas.microsoft.com/office/infopath/2007/PartnerControls"/>
-    <xsd:element name="MediaServiceMetadata" ma:index="8" nillable="true" ma:displayName="MediaServiceMetadata" ma:hidden="true" ma:internalName="MediaServiceMetadata" ma:readOnly="true">
-      <xsd:simpleType>
-        <xsd:restriction base="dms:Note"/>
-      </xsd:simpleType>
-    </xsd:element>
-    <xsd:element name="MediaServiceFastMetadata" ma:index="9" nillable="true" ma:displayName="MediaServiceFastMetadata" ma:hidden="true" ma:internalName="MediaServiceFastMetadata" ma:readOnly="true">
-      <xsd:simpleType>
-        <xsd:restriction base="dms:Note"/>
-      </xsd:simpleType>
-    </xsd:element>
-    <xsd:element name="MediaServiceDateTaken" ma:index="10" nillable="true" ma:displayName="MediaServiceDateTaken" ma:hidden="true" ma:internalName="MediaServiceDateTaken" ma:readOnly="true">
-      <xsd:simpleType>
-        <xsd:restriction base="dms:Text"/>
-      </xsd:simpleType>
-    </xsd:element>
-    <xsd:element name="MediaServiceAutoTags" ma:index="11" nillable="true" ma:displayName="Tags" ma:internalName="MediaServiceAutoTags" ma:readOnly="true">
-      <xsd:simpleType>
-        <xsd:restriction base="dms:Text"/>
-      </xsd:simpleType>
-    </xsd:element>
-    <xsd:element name="MediaServiceGenerationTime" ma:index="12" nillable="true" ma:displayName="MediaServiceGenerationTime" ma:hidden="true" ma:internalName="MediaServiceGenerationTime" ma:readOnly="true">
-      <xsd:simpleType>
-        <xsd:restriction base="dms:Text"/>
-      </xsd:simpleType>
-    </xsd:element>
-    <xsd:element name="MediaServiceEventHashCode" ma:index="13" nillable="true" ma:displayName="MediaServiceEventHashCode" ma:hidden="true" ma:internalName="MediaServiceEventHashCode" ma:readOnly="true">
-      <xsd:simpleType>
-        <xsd:restriction base="dms:Text"/>
-      </xsd:simpleType>
-    </xsd:element>
-    <xsd:element name="MediaServiceOCR" ma:index="14" nillable="true" ma:displayName="Extracted Text" ma:internalName="MediaServiceOCR" ma:readOnly="true">
-      <xsd:simpleType>
-        <xsd:restriction base="dms:Note">
-          <xsd:maxLength value="255"/>
-        </xsd:restriction>
-      </xsd:simpleType>
-    </xsd:element>
-    <xsd:element name="MediaServiceLocation" ma:index="15" nillable="true" ma:displayName="Location" ma:indexed="true" ma:internalName="MediaServiceLocation" ma:readOnly="true">
-      <xsd:simpleType>
-        <xsd:restriction base="dms:Text"/>
-      </xsd:simpleType>
-    </xsd:element>
-    <xsd:element name="MediaLengthInSeconds" ma:index="16" nillable="true" ma:displayName="MediaLengthInSeconds" ma:hidden="true" ma:internalName="MediaLengthInSeconds" ma:readOnly="true">
-      <xsd:simpleType>
-        <xsd:restriction base="dms:Unknown"/>
-      </xsd:simpleType>
-    </xsd:element>
-    <xsd:element name="MediaServiceObjectDetectorVersions" ma:index="17" nillable="true" ma:displayName="MediaServiceObjectDetectorVersions" ma:hidden="true" ma:indexed="true" ma:internalName="MediaServiceObjectDetectorVersions" ma:readOnly="true">
-      <xsd:simpleType>
-        <xsd:restriction base="dms:Text"/>
-      </xsd:simpleType>
-    </xsd:element>
-    <xsd:element name="MediaServiceSystemTags" ma:index="18" nillable="true" ma:displayName="MediaServiceSystemTags" ma:hidden="true" ma:internalName="MediaServiceSystemTags" ma:readOnly="true">
-      <xsd:simpleType>
-        <xsd:restriction base="dms:Note"/>
-      </xsd:simpleType>
-    </xsd:element>
-    <xsd:element name="MediaServiceSearchProperties" ma:index="19" nillable="true" ma:displayName="MediaServiceSearchProperties" ma:hidden="true" ma:internalName="MediaServiceSearchProperties" ma:readOnly="true">
-      <xsd:simpleType>
-        <xsd:restriction base="dms:Note"/>
-      </xsd:simpleType>
-    </xsd:element>
-    <xsd:element name="_activity" ma:index="20" nillable="true" ma:displayName="_activity" ma:hidden="true" ma:internalName="_activity">
-      <xsd:simpleType>
-        <xsd:restriction base="dms:Note"/>
-      </xsd:simpleType>
-    </xsd:element>
-  </xsd:schema>
-  <xsd:schema xmlns="http://schemas.openxmlformats.org/package/2006/metadata/core-properties" xmlns:xsd="http://www.w3.org/2001/XMLSchema" xmlns:xsi="http://www.w3.org/2001/XMLSchema-instance" xmlns:dc="http://purl.org/dc/elements/1.1/" xmlns:dcterms="http://purl.org/dc/terms/" xmlns:odoc="http://schemas.microsoft.com/internal/obd" targetNamespace="http://schemas.openxmlformats.org/package/2006/metadata/core-properties" elementFormDefault="qualified" attributeFormDefault="unqualified" blockDefault="#all">
-    <xsd:import namespace="http://purl.org/dc/elements/1.1/" schemaLocation="http://dublincore.org/schemas/xmls/qdc/2003/04/02/dc.xsd"/>
-    <xsd:import namespace="http://purl.org/dc/terms/" schemaLocation="http://dublincore.org/schemas/xmls/qdc/2003/04/02/dcterms.xsd"/>
-    <xsd:element name="coreProperties" type="CT_coreProperties"/>
-    <xsd:complexType name="CT_coreProperties">
-      <xsd:all>
-        <xsd:element ref="dc:creator" minOccurs="0" maxOccurs="1"/>
-        <xsd:element ref="dcterms:created" minOccurs="0" maxOccurs="1"/>
-        <xsd:element ref="dc:identifier" minOccurs="0" maxOccurs="1"/>
-        <xsd:element name="contentType" minOccurs="0" maxOccurs="1" type="xsd:string" ma:index="0" ma:displayName="Content Type"/>
-        <xsd:element ref="dc:title" minOccurs="0" maxOccurs="1" ma:index="4" ma:displayName="Title"/>
-        <xsd:element ref="dc:subject" minOccurs="0" maxOccurs="1"/>
-        <xsd:element ref="dc:description" minOccurs="0" maxOccurs="1"/>
-        <xsd:element name="keywords" minOccurs="0" maxOccurs="1" type="xsd:string"/>
-        <xsd:element ref="dc:language" minOccurs="0" maxOccurs="1"/>
-        <xsd:element name="category" minOccurs="0" maxOccurs="1" type="xsd:string"/>
-        <xsd:element name="version" minOccurs="0" maxOccurs="1" type="xsd:string"/>
-        <xsd:element name="revision" minOccurs="0" maxOccurs="1" type="xsd:string">
-          <xsd:annotation>
-            <xsd:documentation>
-                        This value indicates the number of saves or revisions. The application is responsible for updating this value after each revision.
-                    </xsd:documentation>
-          </xsd:annotation>
-        </xsd:element>
-        <xsd:element name="lastModifiedBy" minOccurs="0" maxOccurs="1" type="xsd:string"/>
-        <xsd:element ref="dcterms:modified" minOccurs="0" maxOccurs="1"/>
-        <xsd:element name="contentStatus" minOccurs="0" maxOccurs="1" type="xsd:string"/>
-      </xsd:all>
-    </xsd:complexType>
-  </xsd:schema>
-  <xs:schema xmlns:pc="http://schemas.microsoft.com/office/infopath/2007/PartnerControls" xmlns:xs="http://www.w3.org/2001/XMLSchema" targetNamespace="http://schemas.microsoft.com/office/infopath/2007/PartnerControls" elementFormDefault="qualified" attributeFormDefault="unqualified">
-    <xs:element name="Person">
-      <xs:complexType>
-        <xs:sequence>
-          <xs:element ref="pc:DisplayName" minOccurs="0"/>
-          <xs:element ref="pc:AccountId" minOccurs="0"/>
-          <xs:element ref="pc:AccountType" minOccurs="0"/>
-        </xs:sequence>
-      </xs:complexType>
-    </xs:element>
-    <xs:element name="DisplayName" type="xs:string"/>
-    <xs:element name="AccountId" type="xs:string"/>
-    <xs:element name="AccountType" type="xs:string"/>
-    <xs:element name="BDCAssociatedEntity">
-      <xs:complexType>
-        <xs:sequence>
-          <xs:element ref="pc:BDCEntity" minOccurs="0" maxOccurs="unbounded"/>
-        </xs:sequence>
-        <xs:attribute ref="pc:EntityNamespace"/>
-        <xs:attribute ref="pc:EntityName"/>
-        <xs:attribute ref="pc:SystemInstanceName"/>
-        <xs:attribute ref="pc:AssociationName"/>
-      </xs:complexType>
-    </xs:element>
-    <xs:attribute name="EntityNamespace" type="xs:string"/>
-    <xs:attribute name="EntityName" type="xs:string"/>
-    <xs:attribute name="SystemInstanceName" type="xs:string"/>
-    <xs:attribute name="AssociationName" type="xs:string"/>
-    <xs:element name="BDCEntity">
-      <xs:complexType>
-        <xs:sequence>
-          <xs:element ref="pc:EntityDisplayName" minOccurs="0"/>
-          <xs:element ref="pc:EntityInstanceReference" minOccurs="0"/>
-          <xs:element ref="pc:EntityId1" minOccurs="0"/>
-          <xs:element ref="pc:EntityId2" minOccurs="0"/>
-          <xs:element ref="pc:EntityId3" minOccurs="0"/>
-          <xs:element ref="pc:EntityId4" minOccurs="0"/>
-          <xs:element ref="pc:EntityId5" minOccurs="0"/>
-        </xs:sequence>
-      </xs:complexType>
-    </xs:element>
-    <xs:element name="EntityDisplayName" type="xs:string"/>
-    <xs:element name="EntityInstanceReference" type="xs:string"/>
-    <xs:element name="EntityId1" type="xs:string"/>
-    <xs:element name="EntityId2" type="xs:string"/>
-    <xs:element name="EntityId3" type="xs:string"/>
-    <xs:element name="EntityId4" type="xs:string"/>
-    <xs:element name="EntityId5" type="xs:string"/>
-    <xs:element name="Terms">
-      <xs:complexType>
-        <xs:sequence>
-          <xs:element ref="pc:TermInfo" minOccurs="0" maxOccurs="unbounded"/>
-        </xs:sequence>
-      </xs:complexType>
-    </xs:element>
-    <xs:element name="TermInfo">
-      <xs:complexType>
-        <xs:sequence>
-          <xs:element ref="pc:TermName" minOccurs="0"/>
-          <xs:element ref="pc:TermId" minOccurs="0"/>
-        </xs:sequence>
-      </xs:complexType>
-    </xs:element>
-    <xs:element name="TermName" type="xs:string"/>
-    <xs:element name="TermId" type="xs:string"/>
-  </xs:schema>
-</ct:contentTypeSchema>
-</file>
-
-<file path=customXml/item2.xml><?xml version="1.0" encoding="utf-8"?>
-<?mso-contentType ?>
-<FormTemplates xmlns="http://schemas.microsoft.com/sharepoint/v3/contenttype/forms">
-  <Display>DocumentLibraryForm</Display>
-  <Edit>DocumentLibraryForm</Edit>
-  <New>DocumentLibraryForm</New>
-</FormTemplates>
-</file>
-
-<file path=customXml/item3.xml><?xml version="1.0" encoding="utf-8"?>
-<p:properties xmlns:p="http://schemas.microsoft.com/office/2006/metadata/properties" xmlns:xsi="http://www.w3.org/2001/XMLSchema-instance" xmlns:pc="http://schemas.microsoft.com/office/infopath/2007/PartnerControls">
-  <documentManagement>
-    <_activity xmlns="08df0c4f-afa2-4d5e-90e7-353b5d0fb03c" xsi:nil="true"/>
-  </documentManagement>
-</p:properties>
-</file>
-
-<file path=customXml/itemProps1.xml><?xml version="1.0" encoding="utf-8"?>
-<ds:datastoreItem xmlns:ds="http://schemas.openxmlformats.org/officeDocument/2006/customXml" ds:itemID="{34ED1369-03E8-49E0-B1CE-D9FE75494E7A}">
-  <ds:schemaRefs>
-    <ds:schemaRef ds:uri="http://schemas.microsoft.com/office/2006/metadata/contentType"/>
-    <ds:schemaRef ds:uri="http://schemas.microsoft.com/office/2006/metadata/properties/metaAttributes"/>
-    <ds:schemaRef ds:uri="http://www.w3.org/2001/XMLSchema"/>
-    <ds:schemaRef ds:uri="http://schemas.microsoft.com/office/2006/metadata/properties"/>
-    <ds:schemaRef ds:uri="08df0c4f-afa2-4d5e-90e7-353b5d0fb03c"/>
-    <ds:schemaRef ds:uri="http://schemas.microsoft.com/office/2006/documentManagement/types"/>
-    <ds:schemaRef ds:uri="http://schemas.microsoft.com/office/infopath/2007/PartnerControls"/>
-    <ds:schemaRef ds:uri="http://schemas.openxmlformats.org/package/2006/metadata/core-properties"/>
-    <ds:schemaRef ds:uri="http://purl.org/dc/elements/1.1/"/>
-    <ds:schemaRef ds:uri="http://purl.org/dc/terms/"/>
-    <ds:schemaRef ds:uri="http://schemas.microsoft.com/internal/obd"/>
-  </ds:schemaRefs>
-</ds:datastoreItem>
-</file>
-
-<file path=customXml/itemProps2.xml><?xml version="1.0" encoding="utf-8"?>
-<ds:datastoreItem xmlns:ds="http://schemas.openxmlformats.org/officeDocument/2006/customXml" ds:itemID="{FD92C1DA-66E2-494C-828C-FD4AFFC10A62}">
-  <ds:schemaRefs>
-    <ds:schemaRef ds:uri="http://schemas.microsoft.com/sharepoint/v3/contenttype/forms"/>
-  </ds:schemaRefs>
-</ds:datastoreItem>
-</file>
-
-<file path=customXml/itemProps3.xml><?xml version="1.0" encoding="utf-8"?>
-<ds:datastoreItem xmlns:ds="http://schemas.openxmlformats.org/officeDocument/2006/customXml" ds:itemID="{BE5BF0F9-B0A9-4EF8-A4C8-20A2E041B70F}">
-  <ds:schemaRefs>
-    <ds:schemaRef ds:uri="http://purl.org/dc/dcmitype/"/>
-    <ds:schemaRef ds:uri="08df0c4f-afa2-4d5e-90e7-353b5d0fb03c"/>
-    <ds:schemaRef ds:uri="http://schemas.microsoft.com/office/2006/documentManagement/types"/>
-    <ds:schemaRef ds:uri="http://purl.org/dc/terms/"/>
-    <ds:schemaRef ds:uri="http://purl.org/dc/elements/1.1/"/>
-    <ds:schemaRef ds:uri="http://schemas.microsoft.com/office/infopath/2007/PartnerControls"/>
-    <ds:schemaRef ds:uri="http://schemas.openxmlformats.org/package/2006/metadata/core-properties"/>
-    <ds:schemaRef ds:uri="http://schemas.microsoft.com/office/2006/metadata/properties"/>
-    <ds:schemaRef ds:uri="http://www.w3.org/XML/1998/namespace"/>
-  </ds:schemaRefs>
-</ds:datastoreItem>
 </file>
</xml_diff>